<commit_message>
bold italic is so hard
</commit_message>
<xml_diff>
--- a/manifesto-eng.docx
+++ b/manifesto-eng.docx
@@ -487,7 +487,20 @@
           <w:sz w:val="20"/>
           <w:szCs w:val="20"/>
         </w:rPr>
-        <w:t>their algorithm.</w:t>
+        <w:t xml:space="preserve">their </w:t>
+      </w:r>
+      <w:r>
+        <w:rPr>
+          <w:rFonts w:ascii="나눔명조 옛한글" w:eastAsia="나눔명조 옛한글" w:hAnsi="나눔명조 옛한글" w:cs="함초롬바탕"/>
+          <w:b/>
+          <w:bCs/>
+          <w:i/>
+          <w:iCs/>
+          <w:color w:val="000000" w:themeColor="text1"/>
+          <w:sz w:val="20"/>
+          <w:szCs w:val="20"/>
+        </w:rPr>
+        <w:t>algorithm.</w:t>
       </w:r>
     </w:p>
     <w:p>

</xml_diff>